<commit_message>
nmv 07 06 2026
</commit_message>
<xml_diff>
--- a/TS Jatai Ghanam Project/TS 1.8/TS 1.8 Ghanam Malayalam Corrections.docx
+++ b/TS Jatai Ghanam Project/TS 1.8/TS 1.8 Ghanam Malayalam Corrections.docx
@@ -30,10 +30,9 @@
           <w:bCs/>
           <w:sz w:val="32"/>
           <w:szCs w:val="32"/>
-          <w:highlight w:val="red"/>
           <w:u w:val="single"/>
         </w:rPr>
-        <w:t>????</w:t>
+        <w:t>30th June 2026</w:t>
       </w:r>
     </w:p>
     <w:p>
@@ -2992,49 +2991,6 @@
           </w:p>
         </w:tc>
       </w:tr>
-      <w:tr>
-        <w:trPr>
-          <w:trHeight w:val="1338"/>
-        </w:trPr>
-        <w:tc>
-          <w:tcPr>
-            <w:tcW w:w="7379" w:type="dxa"/>
-          </w:tcPr>
-          <w:p>
-            <w:pPr>
-              <w:widowControl w:val="0"/>
-              <w:autoSpaceDE w:val="0"/>
-              <w:autoSpaceDN w:val="0"/>
-              <w:adjustRightInd w:val="0"/>
-              <w:spacing w:line="240" w:lineRule="auto"/>
-              <w:rPr>
-                <w:rFonts w:cs="BRH Malayalam Extra"/>
-                <w:color w:val="000000"/>
-                <w:szCs w:val="40"/>
-              </w:rPr>
-            </w:pPr>
-          </w:p>
-        </w:tc>
-        <w:tc>
-          <w:tcPr>
-            <w:tcW w:w="7442" w:type="dxa"/>
-          </w:tcPr>
-          <w:p>
-            <w:pPr>
-              <w:widowControl w:val="0"/>
-              <w:autoSpaceDE w:val="0"/>
-              <w:autoSpaceDN w:val="0"/>
-              <w:adjustRightInd w:val="0"/>
-              <w:spacing w:line="240" w:lineRule="auto"/>
-              <w:rPr>
-                <w:rFonts w:cs="BRH Malayalam Extra"/>
-                <w:color w:val="000000"/>
-                <w:szCs w:val="40"/>
-              </w:rPr>
-            </w:pPr>
-          </w:p>
-        </w:tc>
-      </w:tr>
     </w:tbl>
     <w:p>
       <w:pPr>
@@ -3048,6 +3004,16 @@
           <w:u w:val="single"/>
         </w:rPr>
       </w:pPr>
+      <w:r>
+        <w:rPr>
+          <w:b/>
+          <w:bCs/>
+          <w:sz w:val="32"/>
+          <w:szCs w:val="32"/>
+          <w:u w:val="single"/>
+        </w:rPr>
+        <w:t>=============</w:t>
+      </w:r>
     </w:p>
     <w:p>
       <w:pPr>
@@ -4561,7 +4527,6 @@
                 <w:highlight w:val="yellow"/>
                 <w:lang w:val="it-IT"/>
               </w:rPr>
-              <w:lastRenderedPageBreak/>
               <w:t>¤¤d</w:t>
             </w:r>
             <w:r>
@@ -4740,7 +4705,6 @@
                 <w:szCs w:val="40"/>
                 <w:lang w:val="it-IT"/>
               </w:rPr>
-              <w:lastRenderedPageBreak/>
               <w:t>13</w:t>
             </w:r>
             <w:r>
@@ -6003,7 +5967,6 @@
                 <w:szCs w:val="40"/>
                 <w:lang w:val="it-IT"/>
               </w:rPr>
-              <w:lastRenderedPageBreak/>
               <w:t>¤¤d</w:t>
             </w:r>
             <w:r>
@@ -6186,6 +6149,34 @@
               <w:adjustRightInd w:val="0"/>
               <w:spacing w:before="0" w:line="240" w:lineRule="auto"/>
               <w:rPr>
+                <w:rFonts w:cs="BRH Malayalam Extra"/>
+                <w:szCs w:val="40"/>
+                <w:lang w:val="it-IT"/>
+              </w:rPr>
+            </w:pPr>
+          </w:p>
+          <w:p>
+            <w:pPr>
+              <w:widowControl w:val="0"/>
+              <w:autoSpaceDE w:val="0"/>
+              <w:autoSpaceDN w:val="0"/>
+              <w:adjustRightInd w:val="0"/>
+              <w:spacing w:before="0" w:line="240" w:lineRule="auto"/>
+              <w:rPr>
+                <w:rFonts w:cs="BRH Malayalam Extra"/>
+                <w:szCs w:val="40"/>
+                <w:lang w:val="it-IT"/>
+              </w:rPr>
+            </w:pPr>
+          </w:p>
+          <w:p>
+            <w:pPr>
+              <w:widowControl w:val="0"/>
+              <w:autoSpaceDE w:val="0"/>
+              <w:autoSpaceDN w:val="0"/>
+              <w:adjustRightInd w:val="0"/>
+              <w:spacing w:before="0" w:line="240" w:lineRule="auto"/>
+              <w:rPr>
                 <w:rFonts w:ascii="BRH Malayalam Extra" w:hAnsi="BRH Malayalam Extra" w:cs="BRH Malayalam Extra"/>
                 <w:sz w:val="32"/>
                 <w:szCs w:val="40"/>
@@ -7149,16 +7140,30 @@
               <w:adjustRightInd w:val="0"/>
               <w:spacing w:before="0" w:line="240" w:lineRule="auto"/>
               <w:rPr>
-                <w:rFonts w:ascii="BRH Malayalam Extra" w:hAnsi="BRH Malayalam Extra" w:cs="BRH Malayalam Extra"/>
-                <w:sz w:val="32"/>
+                <w:rFonts w:cs="BRH Malayalam Extra"/>
                 <w:szCs w:val="40"/>
               </w:rPr>
             </w:pPr>
-            <w:r>
-              <w:rPr>
-                <w:rFonts w:cs="BRH Malayalam Extra"/>
-                <w:szCs w:val="40"/>
-              </w:rPr>
+          </w:p>
+          <w:p>
+            <w:pPr>
+              <w:widowControl w:val="0"/>
+              <w:autoSpaceDE w:val="0"/>
+              <w:autoSpaceDN w:val="0"/>
+              <w:adjustRightInd w:val="0"/>
+              <w:spacing w:before="0" w:line="240" w:lineRule="auto"/>
+              <w:rPr>
+                <w:rFonts w:ascii="BRH Malayalam Extra" w:hAnsi="BRH Malayalam Extra" w:cs="BRH Malayalam Extra"/>
+                <w:sz w:val="32"/>
+                <w:szCs w:val="40"/>
+              </w:rPr>
+            </w:pPr>
+            <w:r>
+              <w:rPr>
+                <w:rFonts w:cs="BRH Malayalam Extra"/>
+                <w:szCs w:val="40"/>
+              </w:rPr>
+              <w:lastRenderedPageBreak/>
               <w:t>10</w:t>
             </w:r>
             <w:r>
@@ -8094,6 +8099,7 @@
                 <w:rFonts w:cs="BRH Malayalam Extra"/>
                 <w:szCs w:val="40"/>
               </w:rPr>
+              <w:lastRenderedPageBreak/>
               <w:t>22</w:t>
             </w:r>
             <w:r>
@@ -8685,174 +8691,10 @@
               <w:adjustRightInd w:val="0"/>
               <w:spacing w:before="0" w:line="240" w:lineRule="auto"/>
               <w:rPr>
-                <w:rFonts w:ascii="BRH Malayalam Extra" w:hAnsi="BRH Malayalam Extra" w:cs="BRH Malayalam Extra"/>
-                <w:sz w:val="32"/>
+                <w:rFonts w:cs="BRH Malayalam Extra"/>
                 <w:szCs w:val="40"/>
               </w:rPr>
             </w:pPr>
-            <w:r>
-              <w:rPr>
-                <w:rFonts w:cs="BRH Malayalam Extra"/>
-                <w:szCs w:val="40"/>
-              </w:rPr>
-              <w:lastRenderedPageBreak/>
-              <w:t>29</w:t>
-            </w:r>
-            <w:r>
-              <w:rPr>
-                <w:rFonts w:ascii="BRH Malayalam Extra" w:hAnsi="BRH Malayalam Extra" w:cs="BRH Malayalam Extra"/>
-                <w:sz w:val="32"/>
-                <w:szCs w:val="40"/>
-              </w:rPr>
-              <w:t>)</w:t>
-            </w:r>
-            <w:r>
-              <w:rPr>
-                <w:rFonts w:ascii="BRH Malayalam Extra" w:hAnsi="BRH Malayalam Extra" w:cs="BRH Malayalam Extra"/>
-                <w:sz w:val="32"/>
-                <w:szCs w:val="40"/>
-              </w:rPr>
-              <w:tab/>
-            </w:r>
-            <w:r>
-              <w:rPr>
-                <w:rFonts w:cs="BRH Malayalam Extra"/>
-                <w:szCs w:val="40"/>
-              </w:rPr>
-              <w:t>1</w:t>
-            </w:r>
-            <w:r>
-              <w:rPr>
-                <w:rFonts w:ascii="BRH Malayalam Extra" w:hAnsi="BRH Malayalam Extra" w:cs="BRH Malayalam Extra"/>
-                <w:sz w:val="32"/>
-                <w:szCs w:val="40"/>
-              </w:rPr>
-              <w:t>.</w:t>
-            </w:r>
-            <w:r>
-              <w:rPr>
-                <w:rFonts w:cs="BRH Malayalam Extra"/>
-                <w:szCs w:val="40"/>
-              </w:rPr>
-              <w:t>8</w:t>
-            </w:r>
-            <w:r>
-              <w:rPr>
-                <w:rFonts w:ascii="BRH Malayalam Extra" w:hAnsi="BRH Malayalam Extra" w:cs="BRH Malayalam Extra"/>
-                <w:sz w:val="32"/>
-                <w:szCs w:val="40"/>
-              </w:rPr>
-              <w:t>.</w:t>
-            </w:r>
-            <w:r>
-              <w:rPr>
-                <w:rFonts w:cs="BRH Malayalam Extra"/>
-                <w:szCs w:val="40"/>
-              </w:rPr>
-              <w:t>4</w:t>
-            </w:r>
-            <w:r>
-              <w:rPr>
-                <w:rFonts w:ascii="BRH Malayalam Extra" w:hAnsi="BRH Malayalam Extra" w:cs="BRH Malayalam Extra"/>
-                <w:sz w:val="32"/>
-                <w:szCs w:val="40"/>
-              </w:rPr>
-              <w:t>.</w:t>
-            </w:r>
-            <w:r>
-              <w:rPr>
-                <w:rFonts w:cs="BRH Malayalam Extra"/>
-                <w:szCs w:val="40"/>
-              </w:rPr>
-              <w:t>1</w:t>
-            </w:r>
-            <w:r>
-              <w:rPr>
-                <w:rFonts w:ascii="BRH Malayalam Extra" w:hAnsi="BRH Malayalam Extra" w:cs="BRH Malayalam Extra"/>
-                <w:sz w:val="32"/>
-                <w:szCs w:val="40"/>
-              </w:rPr>
-              <w:t>(</w:t>
-            </w:r>
-            <w:r>
-              <w:rPr>
-                <w:rFonts w:cs="BRH Malayalam Extra"/>
-                <w:szCs w:val="40"/>
-              </w:rPr>
-              <w:t>22</w:t>
-            </w:r>
-            <w:r>
-              <w:rPr>
-                <w:rFonts w:ascii="BRH Malayalam Extra" w:hAnsi="BRH Malayalam Extra" w:cs="BRH Malayalam Extra"/>
-                <w:sz w:val="32"/>
-                <w:szCs w:val="40"/>
-              </w:rPr>
-              <w:t>)-  ekx˜ | e</w:t>
-            </w:r>
-            <w:r>
-              <w:rPr>
-                <w:rFonts w:ascii="BRH Malayalam Extra" w:hAnsi="BRH Malayalam Extra" w:cs="BRH Malayalam Extra"/>
-                <w:sz w:val="26"/>
-                <w:szCs w:val="40"/>
-              </w:rPr>
-              <w:t>–</w:t>
-            </w:r>
-            <w:r>
-              <w:rPr>
-                <w:rFonts w:ascii="BRH Malayalam Extra" w:hAnsi="BRH Malayalam Extra" w:cs="BRH Malayalam Extra"/>
-                <w:sz w:val="32"/>
-                <w:szCs w:val="40"/>
-              </w:rPr>
-              <w:t>Z</w:t>
-            </w:r>
-            <w:r>
-              <w:rPr>
-                <w:rFonts w:ascii="BRH Malayalam Extra" w:hAnsi="BRH Malayalam Extra" w:cs="BRH Malayalam Extra"/>
-                <w:sz w:val="26"/>
-                <w:szCs w:val="40"/>
-              </w:rPr>
-              <w:t>–</w:t>
-            </w:r>
-            <w:r>
-              <w:rPr>
-                <w:rFonts w:ascii="BRH Malayalam Extra" w:hAnsi="BRH Malayalam Extra" w:cs="BRH Malayalam Extra"/>
-                <w:sz w:val="32"/>
-                <w:szCs w:val="40"/>
-              </w:rPr>
-              <w:t xml:space="preserve"> | s¡e¢</w:t>
-            </w:r>
-            <w:r>
-              <w:rPr>
-                <w:rFonts w:ascii="BRH Malayalam Extra" w:hAnsi="BRH Malayalam Extra" w:cs="BRH Malayalam Extra"/>
-                <w:sz w:val="26"/>
-                <w:szCs w:val="40"/>
-              </w:rPr>
-              <w:t>–</w:t>
-            </w:r>
-            <w:r>
-              <w:rPr>
-                <w:rFonts w:ascii="BRH Malayalam Extra" w:hAnsi="BRH Malayalam Extra" w:cs="BRH Malayalam Extra"/>
-                <w:sz w:val="32"/>
-                <w:szCs w:val="40"/>
-              </w:rPr>
-              <w:t>ªYx</w:t>
-            </w:r>
-            <w:r>
-              <w:rPr>
-                <w:rFonts w:ascii="BRH Malayalam Extra" w:hAnsi="BRH Malayalam Extra" w:cs="BRH Malayalam Extra"/>
-                <w:sz w:val="26"/>
-                <w:szCs w:val="40"/>
-              </w:rPr>
-              <w:t>–</w:t>
-            </w:r>
-            <w:r>
-              <w:rPr>
-                <w:rFonts w:ascii="BRH Malayalam Extra" w:hAnsi="BRH Malayalam Extra" w:cs="BRH Malayalam Extra"/>
-                <w:sz w:val="32"/>
-                <w:szCs w:val="40"/>
-              </w:rPr>
-              <w:t xml:space="preserve"> |</w:t>
-            </w:r>
           </w:p>
           <w:p>
             <w:pPr>
@@ -8862,182 +8704,10 @@
               <w:adjustRightInd w:val="0"/>
               <w:spacing w:before="0" w:line="240" w:lineRule="auto"/>
               <w:rPr>
-                <w:rFonts w:ascii="BRH Malayalam Extra" w:hAnsi="BRH Malayalam Extra" w:cs="BRH Malayalam Extra"/>
-                <w:sz w:val="32"/>
+                <w:rFonts w:cs="BRH Malayalam Extra"/>
                 <w:szCs w:val="40"/>
               </w:rPr>
             </w:pPr>
-            <w:r>
-              <w:rPr>
-                <w:rFonts w:ascii="BRH Malayalam Extra" w:hAnsi="BRH Malayalam Extra" w:cs="BRH Malayalam Extra"/>
-                <w:sz w:val="32"/>
-                <w:szCs w:val="40"/>
-              </w:rPr>
-              <w:t>ekx— eZ eZ</w:t>
-            </w:r>
-            <w:r>
-              <w:rPr>
-                <w:rFonts w:ascii="BRH Malayalam Extra" w:hAnsi="BRH Malayalam Extra" w:cs="BRH Malayalam Extra"/>
-                <w:sz w:val="26"/>
-                <w:szCs w:val="40"/>
-              </w:rPr>
-              <w:t>–</w:t>
-            </w:r>
-            <w:r>
-              <w:rPr>
-                <w:rFonts w:ascii="BRH Malayalam Extra" w:hAnsi="BRH Malayalam Extra" w:cs="BRH Malayalam Extra"/>
-                <w:sz w:val="32"/>
-                <w:szCs w:val="40"/>
-              </w:rPr>
-              <w:t xml:space="preserve"> ekx</w:t>
-            </w:r>
-            <w:r>
-              <w:rPr>
-                <w:rFonts w:ascii="BRH Malayalam Extra" w:hAnsi="BRH Malayalam Extra" w:cs="BRH Malayalam Extra"/>
-                <w:sz w:val="26"/>
-                <w:szCs w:val="40"/>
-              </w:rPr>
-              <w:t>–</w:t>
-            </w:r>
-            <w:r>
-              <w:rPr>
-                <w:rFonts w:ascii="BRH Malayalam Extra" w:hAnsi="BRH Malayalam Extra" w:cs="BRH Malayalam Extra"/>
-                <w:sz w:val="32"/>
-                <w:szCs w:val="40"/>
-              </w:rPr>
-              <w:t xml:space="preserve"> ekx— eZ</w:t>
-            </w:r>
-            <w:r>
-              <w:rPr>
-                <w:rFonts w:ascii="BRH Malayalam Extra" w:hAnsi="BRH Malayalam Extra" w:cs="BRH Malayalam Extra"/>
-                <w:sz w:val="26"/>
-                <w:szCs w:val="40"/>
-              </w:rPr>
-              <w:t>–</w:t>
-            </w:r>
-            <w:r>
-              <w:rPr>
-                <w:rFonts w:ascii="BRH Malayalam Extra" w:hAnsi="BRH Malayalam Extra" w:cs="BRH Malayalam Extra"/>
-                <w:sz w:val="32"/>
-                <w:szCs w:val="40"/>
-              </w:rPr>
-              <w:t xml:space="preserve"> s¡e¢˜ªYx</w:t>
-            </w:r>
-            <w:r>
-              <w:rPr>
-                <w:rFonts w:ascii="BRH Malayalam Extra" w:hAnsi="BRH Malayalam Extra" w:cs="BRH Malayalam Extra"/>
-                <w:sz w:val="26"/>
-                <w:szCs w:val="40"/>
-              </w:rPr>
-              <w:t>–</w:t>
-            </w:r>
-            <w:r>
-              <w:rPr>
-                <w:rFonts w:ascii="BRH Malayalam Extra" w:hAnsi="BRH Malayalam Extra" w:cs="BRH Malayalam Extra"/>
-                <w:sz w:val="32"/>
-                <w:szCs w:val="40"/>
-              </w:rPr>
-              <w:t xml:space="preserve"> s¡e¢</w:t>
-            </w:r>
-            <w:r>
-              <w:rPr>
-                <w:rFonts w:ascii="BRH Malayalam Extra" w:hAnsi="BRH Malayalam Extra" w:cs="BRH Malayalam Extra"/>
-                <w:sz w:val="32"/>
-                <w:szCs w:val="40"/>
-                <w:highlight w:val="yellow"/>
-              </w:rPr>
-              <w:t>˜ªYx</w:t>
-            </w:r>
-            <w:r>
-              <w:rPr>
-                <w:rFonts w:ascii="BRH Malayalam Extra" w:hAnsi="BRH Malayalam Extra" w:cs="BRH Malayalam Extra"/>
-                <w:sz w:val="26"/>
-                <w:szCs w:val="40"/>
-                <w:highlight w:val="yellow"/>
-              </w:rPr>
-              <w:t>–</w:t>
-            </w:r>
-            <w:r>
-              <w:rPr>
-                <w:rFonts w:ascii="BRH Malayalam Extra" w:hAnsi="BRH Malayalam Extra" w:cs="BRH Malayalam Extra"/>
-                <w:sz w:val="32"/>
-                <w:szCs w:val="40"/>
-              </w:rPr>
-              <w:t xml:space="preserve"> eZ</w:t>
-            </w:r>
-            <w:r>
-              <w:rPr>
-                <w:rFonts w:ascii="BRH Malayalam Extra" w:hAnsi="BRH Malayalam Extra" w:cs="BRH Malayalam Extra"/>
-                <w:sz w:val="26"/>
-                <w:szCs w:val="40"/>
-              </w:rPr>
-              <w:t>–</w:t>
-            </w:r>
-            <w:r>
-              <w:rPr>
-                <w:rFonts w:ascii="BRH Malayalam Extra" w:hAnsi="BRH Malayalam Extra" w:cs="BRH Malayalam Extra"/>
-                <w:sz w:val="32"/>
-                <w:szCs w:val="40"/>
-              </w:rPr>
-              <w:t xml:space="preserve"> ekx</w:t>
-            </w:r>
-            <w:r>
-              <w:rPr>
-                <w:rFonts w:ascii="BRH Malayalam Extra" w:hAnsi="BRH Malayalam Extra" w:cs="BRH Malayalam Extra"/>
-                <w:sz w:val="26"/>
-                <w:szCs w:val="40"/>
-              </w:rPr>
-              <w:t>–</w:t>
-            </w:r>
-            <w:r>
-              <w:rPr>
-                <w:rFonts w:ascii="BRH Malayalam Extra" w:hAnsi="BRH Malayalam Extra" w:cs="BRH Malayalam Extra"/>
-                <w:sz w:val="32"/>
-                <w:szCs w:val="40"/>
-              </w:rPr>
-              <w:t xml:space="preserve"> ekx— eZ</w:t>
-            </w:r>
-            <w:r>
-              <w:rPr>
-                <w:rFonts w:ascii="BRH Malayalam Extra" w:hAnsi="BRH Malayalam Extra" w:cs="BRH Malayalam Extra"/>
-                <w:sz w:val="26"/>
-                <w:szCs w:val="40"/>
-              </w:rPr>
-              <w:t>–</w:t>
-            </w:r>
-            <w:r>
-              <w:rPr>
-                <w:rFonts w:ascii="BRH Malayalam Extra" w:hAnsi="BRH Malayalam Extra" w:cs="BRH Malayalam Extra"/>
-                <w:sz w:val="32"/>
-                <w:szCs w:val="40"/>
-              </w:rPr>
-              <w:t xml:space="preserve"> s¡e¢˜ª</w:t>
-            </w:r>
-            <w:r>
-              <w:rPr>
-                <w:rFonts w:ascii="BRH Malayalam Extra" w:hAnsi="BRH Malayalam Extra" w:cs="BRH Malayalam Extra"/>
-                <w:sz w:val="32"/>
-                <w:szCs w:val="40"/>
-                <w:highlight w:val="yellow"/>
-              </w:rPr>
-              <w:t>Yx</w:t>
-            </w:r>
-            <w:r>
-              <w:rPr>
-                <w:rFonts w:ascii="BRH Malayalam Extra" w:hAnsi="BRH Malayalam Extra" w:cs="BRH Malayalam Extra"/>
-                <w:sz w:val="26"/>
-                <w:szCs w:val="40"/>
-              </w:rPr>
-              <w:t>–</w:t>
-            </w:r>
-            <w:r>
-              <w:rPr>
-                <w:rFonts w:ascii="BRH Malayalam Extra" w:hAnsi="BRH Malayalam Extra" w:cs="BRH Malayalam Extra"/>
-                <w:sz w:val="32"/>
-                <w:szCs w:val="40"/>
-              </w:rPr>
-              <w:t xml:space="preserve"> | </w:t>
-            </w:r>
           </w:p>
           <w:p>
             <w:pPr>
@@ -9047,11 +8717,385 @@
               <w:adjustRightInd w:val="0"/>
               <w:spacing w:before="0" w:line="240" w:lineRule="auto"/>
               <w:rPr>
-                <w:rFonts w:ascii="BRH Malayalam Extra" w:hAnsi="BRH Malayalam Extra" w:cs="BRH Malayalam Extra"/>
-                <w:sz w:val="32"/>
+                <w:rFonts w:cs="BRH Malayalam Extra"/>
                 <w:szCs w:val="40"/>
               </w:rPr>
             </w:pPr>
+          </w:p>
+          <w:p>
+            <w:pPr>
+              <w:widowControl w:val="0"/>
+              <w:autoSpaceDE w:val="0"/>
+              <w:autoSpaceDN w:val="0"/>
+              <w:adjustRightInd w:val="0"/>
+              <w:spacing w:before="0" w:line="240" w:lineRule="auto"/>
+              <w:rPr>
+                <w:rFonts w:cs="BRH Malayalam Extra"/>
+                <w:szCs w:val="40"/>
+              </w:rPr>
+            </w:pPr>
+          </w:p>
+          <w:p>
+            <w:pPr>
+              <w:widowControl w:val="0"/>
+              <w:autoSpaceDE w:val="0"/>
+              <w:autoSpaceDN w:val="0"/>
+              <w:adjustRightInd w:val="0"/>
+              <w:spacing w:before="0" w:line="240" w:lineRule="auto"/>
+              <w:rPr>
+                <w:rFonts w:ascii="BRH Malayalam Extra" w:hAnsi="BRH Malayalam Extra" w:cs="BRH Malayalam Extra"/>
+                <w:sz w:val="32"/>
+                <w:szCs w:val="40"/>
+              </w:rPr>
+            </w:pPr>
+            <w:r>
+              <w:rPr>
+                <w:rFonts w:cs="BRH Malayalam Extra"/>
+                <w:szCs w:val="40"/>
+              </w:rPr>
+              <w:lastRenderedPageBreak/>
+              <w:t>29</w:t>
+            </w:r>
+            <w:r>
+              <w:rPr>
+                <w:rFonts w:ascii="BRH Malayalam Extra" w:hAnsi="BRH Malayalam Extra" w:cs="BRH Malayalam Extra"/>
+                <w:sz w:val="32"/>
+                <w:szCs w:val="40"/>
+              </w:rPr>
+              <w:t>)</w:t>
+            </w:r>
+            <w:r>
+              <w:rPr>
+                <w:rFonts w:ascii="BRH Malayalam Extra" w:hAnsi="BRH Malayalam Extra" w:cs="BRH Malayalam Extra"/>
+                <w:sz w:val="32"/>
+                <w:szCs w:val="40"/>
+              </w:rPr>
+              <w:tab/>
+            </w:r>
+            <w:r>
+              <w:rPr>
+                <w:rFonts w:cs="BRH Malayalam Extra"/>
+                <w:szCs w:val="40"/>
+              </w:rPr>
+              <w:t>1</w:t>
+            </w:r>
+            <w:r>
+              <w:rPr>
+                <w:rFonts w:ascii="BRH Malayalam Extra" w:hAnsi="BRH Malayalam Extra" w:cs="BRH Malayalam Extra"/>
+                <w:sz w:val="32"/>
+                <w:szCs w:val="40"/>
+              </w:rPr>
+              <w:t>.</w:t>
+            </w:r>
+            <w:r>
+              <w:rPr>
+                <w:rFonts w:cs="BRH Malayalam Extra"/>
+                <w:szCs w:val="40"/>
+              </w:rPr>
+              <w:t>8</w:t>
+            </w:r>
+            <w:r>
+              <w:rPr>
+                <w:rFonts w:ascii="BRH Malayalam Extra" w:hAnsi="BRH Malayalam Extra" w:cs="BRH Malayalam Extra"/>
+                <w:sz w:val="32"/>
+                <w:szCs w:val="40"/>
+              </w:rPr>
+              <w:t>.</w:t>
+            </w:r>
+            <w:r>
+              <w:rPr>
+                <w:rFonts w:cs="BRH Malayalam Extra"/>
+                <w:szCs w:val="40"/>
+              </w:rPr>
+              <w:t>4</w:t>
+            </w:r>
+            <w:r>
+              <w:rPr>
+                <w:rFonts w:ascii="BRH Malayalam Extra" w:hAnsi="BRH Malayalam Extra" w:cs="BRH Malayalam Extra"/>
+                <w:sz w:val="32"/>
+                <w:szCs w:val="40"/>
+              </w:rPr>
+              <w:t>.</w:t>
+            </w:r>
+            <w:r>
+              <w:rPr>
+                <w:rFonts w:cs="BRH Malayalam Extra"/>
+                <w:szCs w:val="40"/>
+              </w:rPr>
+              <w:t>1</w:t>
+            </w:r>
+            <w:r>
+              <w:rPr>
+                <w:rFonts w:ascii="BRH Malayalam Extra" w:hAnsi="BRH Malayalam Extra" w:cs="BRH Malayalam Extra"/>
+                <w:sz w:val="32"/>
+                <w:szCs w:val="40"/>
+              </w:rPr>
+              <w:t>(</w:t>
+            </w:r>
+            <w:r>
+              <w:rPr>
+                <w:rFonts w:cs="BRH Malayalam Extra"/>
+                <w:szCs w:val="40"/>
+              </w:rPr>
+              <w:t>22</w:t>
+            </w:r>
+            <w:r>
+              <w:rPr>
+                <w:rFonts w:ascii="BRH Malayalam Extra" w:hAnsi="BRH Malayalam Extra" w:cs="BRH Malayalam Extra"/>
+                <w:sz w:val="32"/>
+                <w:szCs w:val="40"/>
+              </w:rPr>
+              <w:t>)-  ekx˜ | e</w:t>
+            </w:r>
+            <w:r>
+              <w:rPr>
+                <w:rFonts w:ascii="BRH Malayalam Extra" w:hAnsi="BRH Malayalam Extra" w:cs="BRH Malayalam Extra"/>
+                <w:sz w:val="26"/>
+                <w:szCs w:val="40"/>
+              </w:rPr>
+              <w:t>–</w:t>
+            </w:r>
+            <w:r>
+              <w:rPr>
+                <w:rFonts w:ascii="BRH Malayalam Extra" w:hAnsi="BRH Malayalam Extra" w:cs="BRH Malayalam Extra"/>
+                <w:sz w:val="32"/>
+                <w:szCs w:val="40"/>
+              </w:rPr>
+              <w:t>Z</w:t>
+            </w:r>
+            <w:r>
+              <w:rPr>
+                <w:rFonts w:ascii="BRH Malayalam Extra" w:hAnsi="BRH Malayalam Extra" w:cs="BRH Malayalam Extra"/>
+                <w:sz w:val="26"/>
+                <w:szCs w:val="40"/>
+              </w:rPr>
+              <w:t>–</w:t>
+            </w:r>
+            <w:r>
+              <w:rPr>
+                <w:rFonts w:ascii="BRH Malayalam Extra" w:hAnsi="BRH Malayalam Extra" w:cs="BRH Malayalam Extra"/>
+                <w:sz w:val="32"/>
+                <w:szCs w:val="40"/>
+              </w:rPr>
+              <w:t xml:space="preserve"> | s¡e¢</w:t>
+            </w:r>
+            <w:r>
+              <w:rPr>
+                <w:rFonts w:ascii="BRH Malayalam Extra" w:hAnsi="BRH Malayalam Extra" w:cs="BRH Malayalam Extra"/>
+                <w:sz w:val="26"/>
+                <w:szCs w:val="40"/>
+              </w:rPr>
+              <w:t>–</w:t>
+            </w:r>
+            <w:r>
+              <w:rPr>
+                <w:rFonts w:ascii="BRH Malayalam Extra" w:hAnsi="BRH Malayalam Extra" w:cs="BRH Malayalam Extra"/>
+                <w:sz w:val="32"/>
+                <w:szCs w:val="40"/>
+              </w:rPr>
+              <w:t>ªYx</w:t>
+            </w:r>
+            <w:r>
+              <w:rPr>
+                <w:rFonts w:ascii="BRH Malayalam Extra" w:hAnsi="BRH Malayalam Extra" w:cs="BRH Malayalam Extra"/>
+                <w:sz w:val="26"/>
+                <w:szCs w:val="40"/>
+              </w:rPr>
+              <w:t>–</w:t>
+            </w:r>
+            <w:r>
+              <w:rPr>
+                <w:rFonts w:ascii="BRH Malayalam Extra" w:hAnsi="BRH Malayalam Extra" w:cs="BRH Malayalam Extra"/>
+                <w:sz w:val="32"/>
+                <w:szCs w:val="40"/>
+              </w:rPr>
+              <w:t xml:space="preserve"> |</w:t>
+            </w:r>
+          </w:p>
+          <w:p>
+            <w:pPr>
+              <w:widowControl w:val="0"/>
+              <w:autoSpaceDE w:val="0"/>
+              <w:autoSpaceDN w:val="0"/>
+              <w:adjustRightInd w:val="0"/>
+              <w:spacing w:before="0" w:line="240" w:lineRule="auto"/>
+              <w:rPr>
+                <w:rFonts w:ascii="BRH Malayalam Extra" w:hAnsi="BRH Malayalam Extra" w:cs="BRH Malayalam Extra"/>
+                <w:sz w:val="32"/>
+                <w:szCs w:val="40"/>
+              </w:rPr>
+            </w:pPr>
+            <w:r>
+              <w:rPr>
+                <w:rFonts w:ascii="BRH Malayalam Extra" w:hAnsi="BRH Malayalam Extra" w:cs="BRH Malayalam Extra"/>
+                <w:sz w:val="32"/>
+                <w:szCs w:val="40"/>
+              </w:rPr>
+              <w:t>ekx— eZ eZ</w:t>
+            </w:r>
+            <w:r>
+              <w:rPr>
+                <w:rFonts w:ascii="BRH Malayalam Extra" w:hAnsi="BRH Malayalam Extra" w:cs="BRH Malayalam Extra"/>
+                <w:sz w:val="26"/>
+                <w:szCs w:val="40"/>
+              </w:rPr>
+              <w:t>–</w:t>
+            </w:r>
+            <w:r>
+              <w:rPr>
+                <w:rFonts w:ascii="BRH Malayalam Extra" w:hAnsi="BRH Malayalam Extra" w:cs="BRH Malayalam Extra"/>
+                <w:sz w:val="32"/>
+                <w:szCs w:val="40"/>
+              </w:rPr>
+              <w:t xml:space="preserve"> ekx</w:t>
+            </w:r>
+            <w:r>
+              <w:rPr>
+                <w:rFonts w:ascii="BRH Malayalam Extra" w:hAnsi="BRH Malayalam Extra" w:cs="BRH Malayalam Extra"/>
+                <w:sz w:val="26"/>
+                <w:szCs w:val="40"/>
+              </w:rPr>
+              <w:t>–</w:t>
+            </w:r>
+            <w:r>
+              <w:rPr>
+                <w:rFonts w:ascii="BRH Malayalam Extra" w:hAnsi="BRH Malayalam Extra" w:cs="BRH Malayalam Extra"/>
+                <w:sz w:val="32"/>
+                <w:szCs w:val="40"/>
+              </w:rPr>
+              <w:t xml:space="preserve"> ekx— eZ</w:t>
+            </w:r>
+            <w:r>
+              <w:rPr>
+                <w:rFonts w:ascii="BRH Malayalam Extra" w:hAnsi="BRH Malayalam Extra" w:cs="BRH Malayalam Extra"/>
+                <w:sz w:val="26"/>
+                <w:szCs w:val="40"/>
+              </w:rPr>
+              <w:t>–</w:t>
+            </w:r>
+            <w:r>
+              <w:rPr>
+                <w:rFonts w:ascii="BRH Malayalam Extra" w:hAnsi="BRH Malayalam Extra" w:cs="BRH Malayalam Extra"/>
+                <w:sz w:val="32"/>
+                <w:szCs w:val="40"/>
+              </w:rPr>
+              <w:t xml:space="preserve"> s¡e¢˜ªYx</w:t>
+            </w:r>
+            <w:r>
+              <w:rPr>
+                <w:rFonts w:ascii="BRH Malayalam Extra" w:hAnsi="BRH Malayalam Extra" w:cs="BRH Malayalam Extra"/>
+                <w:sz w:val="26"/>
+                <w:szCs w:val="40"/>
+              </w:rPr>
+              <w:t>–</w:t>
+            </w:r>
+            <w:r>
+              <w:rPr>
+                <w:rFonts w:ascii="BRH Malayalam Extra" w:hAnsi="BRH Malayalam Extra" w:cs="BRH Malayalam Extra"/>
+                <w:sz w:val="32"/>
+                <w:szCs w:val="40"/>
+              </w:rPr>
+              <w:t xml:space="preserve"> s¡e¢</w:t>
+            </w:r>
+            <w:r>
+              <w:rPr>
+                <w:rFonts w:ascii="BRH Malayalam Extra" w:hAnsi="BRH Malayalam Extra" w:cs="BRH Malayalam Extra"/>
+                <w:sz w:val="32"/>
+                <w:szCs w:val="40"/>
+                <w:highlight w:val="yellow"/>
+              </w:rPr>
+              <w:t>˜ªYx</w:t>
+            </w:r>
+            <w:r>
+              <w:rPr>
+                <w:rFonts w:ascii="BRH Malayalam Extra" w:hAnsi="BRH Malayalam Extra" w:cs="BRH Malayalam Extra"/>
+                <w:sz w:val="26"/>
+                <w:szCs w:val="40"/>
+                <w:highlight w:val="yellow"/>
+              </w:rPr>
+              <w:t>–</w:t>
+            </w:r>
+            <w:r>
+              <w:rPr>
+                <w:rFonts w:ascii="BRH Malayalam Extra" w:hAnsi="BRH Malayalam Extra" w:cs="BRH Malayalam Extra"/>
+                <w:sz w:val="32"/>
+                <w:szCs w:val="40"/>
+              </w:rPr>
+              <w:t xml:space="preserve"> eZ</w:t>
+            </w:r>
+            <w:r>
+              <w:rPr>
+                <w:rFonts w:ascii="BRH Malayalam Extra" w:hAnsi="BRH Malayalam Extra" w:cs="BRH Malayalam Extra"/>
+                <w:sz w:val="26"/>
+                <w:szCs w:val="40"/>
+              </w:rPr>
+              <w:t>–</w:t>
+            </w:r>
+            <w:r>
+              <w:rPr>
+                <w:rFonts w:ascii="BRH Malayalam Extra" w:hAnsi="BRH Malayalam Extra" w:cs="BRH Malayalam Extra"/>
+                <w:sz w:val="32"/>
+                <w:szCs w:val="40"/>
+              </w:rPr>
+              <w:t xml:space="preserve"> ekx</w:t>
+            </w:r>
+            <w:r>
+              <w:rPr>
+                <w:rFonts w:ascii="BRH Malayalam Extra" w:hAnsi="BRH Malayalam Extra" w:cs="BRH Malayalam Extra"/>
+                <w:sz w:val="26"/>
+                <w:szCs w:val="40"/>
+              </w:rPr>
+              <w:t>–</w:t>
+            </w:r>
+            <w:r>
+              <w:rPr>
+                <w:rFonts w:ascii="BRH Malayalam Extra" w:hAnsi="BRH Malayalam Extra" w:cs="BRH Malayalam Extra"/>
+                <w:sz w:val="32"/>
+                <w:szCs w:val="40"/>
+              </w:rPr>
+              <w:t xml:space="preserve"> ekx— eZ</w:t>
+            </w:r>
+            <w:r>
+              <w:rPr>
+                <w:rFonts w:ascii="BRH Malayalam Extra" w:hAnsi="BRH Malayalam Extra" w:cs="BRH Malayalam Extra"/>
+                <w:sz w:val="26"/>
+                <w:szCs w:val="40"/>
+              </w:rPr>
+              <w:t>–</w:t>
+            </w:r>
+            <w:r>
+              <w:rPr>
+                <w:rFonts w:ascii="BRH Malayalam Extra" w:hAnsi="BRH Malayalam Extra" w:cs="BRH Malayalam Extra"/>
+                <w:sz w:val="32"/>
+                <w:szCs w:val="40"/>
+              </w:rPr>
+              <w:t xml:space="preserve"> s¡e¢˜ª</w:t>
+            </w:r>
+            <w:r>
+              <w:rPr>
+                <w:rFonts w:ascii="BRH Malayalam Extra" w:hAnsi="BRH Malayalam Extra" w:cs="BRH Malayalam Extra"/>
+                <w:sz w:val="32"/>
+                <w:szCs w:val="40"/>
+                <w:highlight w:val="yellow"/>
+              </w:rPr>
+              <w:t>Yx</w:t>
+            </w:r>
+            <w:r>
+              <w:rPr>
+                <w:rFonts w:ascii="BRH Malayalam Extra" w:hAnsi="BRH Malayalam Extra" w:cs="BRH Malayalam Extra"/>
+                <w:sz w:val="26"/>
+                <w:szCs w:val="40"/>
+              </w:rPr>
+              <w:t>–</w:t>
+            </w:r>
+            <w:r>
+              <w:rPr>
+                <w:rFonts w:ascii="BRH Malayalam Extra" w:hAnsi="BRH Malayalam Extra" w:cs="BRH Malayalam Extra"/>
+                <w:sz w:val="32"/>
+                <w:szCs w:val="40"/>
+              </w:rPr>
+              <w:t xml:space="preserve"> | </w:t>
+            </w:r>
           </w:p>
           <w:p>
             <w:pPr>
@@ -10056,158 +10100,10 @@
               <w:adjustRightInd w:val="0"/>
               <w:spacing w:before="0" w:line="240" w:lineRule="auto"/>
               <w:rPr>
-                <w:rFonts w:ascii="BRH Malayalam Extra" w:hAnsi="BRH Malayalam Extra" w:cs="BRH Malayalam Extra"/>
-                <w:sz w:val="32"/>
+                <w:rFonts w:cs="BRH Malayalam Extra"/>
                 <w:szCs w:val="40"/>
               </w:rPr>
             </w:pPr>
-            <w:r>
-              <w:rPr>
-                <w:rFonts w:cs="BRH Malayalam Extra"/>
-                <w:szCs w:val="40"/>
-              </w:rPr>
-              <w:t>29</w:t>
-            </w:r>
-            <w:r>
-              <w:rPr>
-                <w:rFonts w:ascii="BRH Malayalam Extra" w:hAnsi="BRH Malayalam Extra" w:cs="BRH Malayalam Extra"/>
-                <w:sz w:val="32"/>
-                <w:szCs w:val="40"/>
-              </w:rPr>
-              <w:t>)</w:t>
-            </w:r>
-            <w:r>
-              <w:rPr>
-                <w:rFonts w:ascii="BRH Malayalam Extra" w:hAnsi="BRH Malayalam Extra" w:cs="BRH Malayalam Extra"/>
-                <w:sz w:val="32"/>
-                <w:szCs w:val="40"/>
-              </w:rPr>
-              <w:tab/>
-            </w:r>
-            <w:r>
-              <w:rPr>
-                <w:rFonts w:cs="BRH Malayalam Extra"/>
-                <w:szCs w:val="40"/>
-              </w:rPr>
-              <w:t>1</w:t>
-            </w:r>
-            <w:r>
-              <w:rPr>
-                <w:rFonts w:ascii="BRH Malayalam Extra" w:hAnsi="BRH Malayalam Extra" w:cs="BRH Malayalam Extra"/>
-                <w:sz w:val="32"/>
-                <w:szCs w:val="40"/>
-              </w:rPr>
-              <w:t>.</w:t>
-            </w:r>
-            <w:r>
-              <w:rPr>
-                <w:rFonts w:cs="BRH Malayalam Extra"/>
-                <w:szCs w:val="40"/>
-              </w:rPr>
-              <w:t>8</w:t>
-            </w:r>
-            <w:r>
-              <w:rPr>
-                <w:rFonts w:ascii="BRH Malayalam Extra" w:hAnsi="BRH Malayalam Extra" w:cs="BRH Malayalam Extra"/>
-                <w:sz w:val="32"/>
-                <w:szCs w:val="40"/>
-              </w:rPr>
-              <w:t>.</w:t>
-            </w:r>
-            <w:r>
-              <w:rPr>
-                <w:rFonts w:cs="BRH Malayalam Extra"/>
-                <w:szCs w:val="40"/>
-              </w:rPr>
-              <w:t>4</w:t>
-            </w:r>
-            <w:r>
-              <w:rPr>
-                <w:rFonts w:ascii="BRH Malayalam Extra" w:hAnsi="BRH Malayalam Extra" w:cs="BRH Malayalam Extra"/>
-                <w:sz w:val="32"/>
-                <w:szCs w:val="40"/>
-              </w:rPr>
-              <w:t>.</w:t>
-            </w:r>
-            <w:r>
-              <w:rPr>
-                <w:rFonts w:cs="BRH Malayalam Extra"/>
-                <w:szCs w:val="40"/>
-              </w:rPr>
-              <w:t>1</w:t>
-            </w:r>
-            <w:r>
-              <w:rPr>
-                <w:rFonts w:ascii="BRH Malayalam Extra" w:hAnsi="BRH Malayalam Extra" w:cs="BRH Malayalam Extra"/>
-                <w:sz w:val="32"/>
-                <w:szCs w:val="40"/>
-              </w:rPr>
-              <w:t>(</w:t>
-            </w:r>
-            <w:r>
-              <w:rPr>
-                <w:rFonts w:cs="BRH Malayalam Extra"/>
-                <w:szCs w:val="40"/>
-              </w:rPr>
-              <w:t>22</w:t>
-            </w:r>
-            <w:r>
-              <w:rPr>
-                <w:rFonts w:ascii="BRH Malayalam Extra" w:hAnsi="BRH Malayalam Extra" w:cs="BRH Malayalam Extra"/>
-                <w:sz w:val="32"/>
-                <w:szCs w:val="40"/>
-              </w:rPr>
-              <w:t>)-  ekx˜ | e</w:t>
-            </w:r>
-            <w:r>
-              <w:rPr>
-                <w:rFonts w:ascii="BRH Malayalam Extra" w:hAnsi="BRH Malayalam Extra" w:cs="BRH Malayalam Extra"/>
-                <w:sz w:val="26"/>
-                <w:szCs w:val="40"/>
-              </w:rPr>
-              <w:t>–</w:t>
-            </w:r>
-            <w:r>
-              <w:rPr>
-                <w:rFonts w:ascii="BRH Malayalam Extra" w:hAnsi="BRH Malayalam Extra" w:cs="BRH Malayalam Extra"/>
-                <w:sz w:val="32"/>
-                <w:szCs w:val="40"/>
-              </w:rPr>
-              <w:t>Z</w:t>
-            </w:r>
-            <w:r>
-              <w:rPr>
-                <w:rFonts w:ascii="BRH Malayalam Extra" w:hAnsi="BRH Malayalam Extra" w:cs="BRH Malayalam Extra"/>
-                <w:sz w:val="26"/>
-                <w:szCs w:val="40"/>
-              </w:rPr>
-              <w:t>–</w:t>
-            </w:r>
-            <w:r>
-              <w:rPr>
-                <w:rFonts w:ascii="BRH Malayalam Extra" w:hAnsi="BRH Malayalam Extra" w:cs="BRH Malayalam Extra"/>
-                <w:sz w:val="32"/>
-                <w:szCs w:val="40"/>
-              </w:rPr>
-              <w:t xml:space="preserve"> | s¡</w:t>
-            </w:r>
-            <w:r>
-              <w:rPr>
-                <w:rFonts w:ascii="BRH Malayalam Extra" w:hAnsi="BRH Malayalam Extra" w:cs="BRH Malayalam Extra"/>
-                <w:sz w:val="32"/>
-                <w:szCs w:val="40"/>
-                <w:highlight w:val="green"/>
-              </w:rPr>
-              <w:t>e¢˜ªYx</w:t>
-            </w:r>
-            <w:r>
-              <w:rPr>
-                <w:rFonts w:ascii="BRH Malayalam Extra" w:hAnsi="BRH Malayalam Extra" w:cs="BRH Malayalam Extra"/>
-                <w:sz w:val="32"/>
-                <w:szCs w:val="40"/>
-              </w:rPr>
-              <w:t xml:space="preserve"> |</w:t>
-            </w:r>
           </w:p>
           <w:p>
             <w:pPr>
@@ -10217,165 +10113,11 @@
               <w:adjustRightInd w:val="0"/>
               <w:spacing w:before="0" w:line="240" w:lineRule="auto"/>
               <w:rPr>
-                <w:rFonts w:ascii="BRH Malayalam Extra" w:hAnsi="BRH Malayalam Extra" w:cs="BRH Malayalam Extra"/>
-                <w:sz w:val="32"/>
-                <w:szCs w:val="40"/>
+                <w:rFonts w:cs="BRH Malayalam Extra"/>
+                <w:szCs w:val="40"/>
+                <w:lang w:bidi="ta-IN"/>
               </w:rPr>
             </w:pPr>
-            <w:r>
-              <w:rPr>
-                <w:rFonts w:ascii="BRH Malayalam Extra" w:hAnsi="BRH Malayalam Extra" w:cs="BRH Malayalam Extra"/>
-                <w:sz w:val="32"/>
-                <w:szCs w:val="40"/>
-              </w:rPr>
-              <w:t>ekx— eZ eZ</w:t>
-            </w:r>
-            <w:r>
-              <w:rPr>
-                <w:rFonts w:ascii="BRH Malayalam Extra" w:hAnsi="BRH Malayalam Extra" w:cs="BRH Malayalam Extra"/>
-                <w:sz w:val="26"/>
-                <w:szCs w:val="40"/>
-              </w:rPr>
-              <w:t>–</w:t>
-            </w:r>
-            <w:r>
-              <w:rPr>
-                <w:rFonts w:ascii="BRH Malayalam Extra" w:hAnsi="BRH Malayalam Extra" w:cs="BRH Malayalam Extra"/>
-                <w:sz w:val="32"/>
-                <w:szCs w:val="40"/>
-              </w:rPr>
-              <w:t xml:space="preserve"> ekx</w:t>
-            </w:r>
-            <w:r>
-              <w:rPr>
-                <w:rFonts w:ascii="BRH Malayalam Extra" w:hAnsi="BRH Malayalam Extra" w:cs="BRH Malayalam Extra"/>
-                <w:sz w:val="26"/>
-                <w:szCs w:val="40"/>
-              </w:rPr>
-              <w:t>–</w:t>
-            </w:r>
-            <w:r>
-              <w:rPr>
-                <w:rFonts w:ascii="BRH Malayalam Extra" w:hAnsi="BRH Malayalam Extra" w:cs="BRH Malayalam Extra"/>
-                <w:sz w:val="32"/>
-                <w:szCs w:val="40"/>
-              </w:rPr>
-              <w:t xml:space="preserve"> ekx— eZ</w:t>
-            </w:r>
-            <w:r>
-              <w:rPr>
-                <w:rFonts w:ascii="BRH Malayalam Extra" w:hAnsi="BRH Malayalam Extra" w:cs="BRH Malayalam Extra"/>
-                <w:sz w:val="26"/>
-                <w:szCs w:val="40"/>
-              </w:rPr>
-              <w:t>–</w:t>
-            </w:r>
-            <w:r>
-              <w:rPr>
-                <w:rFonts w:ascii="BRH Malayalam Extra" w:hAnsi="BRH Malayalam Extra" w:cs="BRH Malayalam Extra"/>
-                <w:sz w:val="32"/>
-                <w:szCs w:val="40"/>
-              </w:rPr>
-              <w:t xml:space="preserve"> s¡e¢˜ªYx</w:t>
-            </w:r>
-            <w:r>
-              <w:rPr>
-                <w:rFonts w:ascii="BRH Malayalam Extra" w:hAnsi="BRH Malayalam Extra" w:cs="BRH Malayalam Extra"/>
-                <w:sz w:val="26"/>
-                <w:szCs w:val="40"/>
-              </w:rPr>
-              <w:t>–</w:t>
-            </w:r>
-            <w:r>
-              <w:rPr>
-                <w:rFonts w:ascii="BRH Malayalam Extra" w:hAnsi="BRH Malayalam Extra" w:cs="BRH Malayalam Extra"/>
-                <w:sz w:val="32"/>
-                <w:szCs w:val="40"/>
-              </w:rPr>
-              <w:t xml:space="preserve"> s¡e¢˜ª</w:t>
-            </w:r>
-            <w:r>
-              <w:rPr>
-                <w:rFonts w:ascii="BRH Malayalam Extra" w:hAnsi="BRH Malayalam Extra" w:cs="BRH Malayalam Extra"/>
-                <w:sz w:val="32"/>
-                <w:szCs w:val="40"/>
-                <w:highlight w:val="green"/>
-              </w:rPr>
-              <w:t>Yx</w:t>
-            </w:r>
-            <w:r>
-              <w:rPr>
-                <w:rFonts w:ascii="BRH Malayalam Extra" w:hAnsi="BRH Malayalam Extra" w:cs="BRH Malayalam Extra"/>
-                <w:sz w:val="32"/>
-                <w:szCs w:val="40"/>
-              </w:rPr>
-              <w:t xml:space="preserve"> eZ</w:t>
-            </w:r>
-            <w:r>
-              <w:rPr>
-                <w:rFonts w:ascii="BRH Malayalam Extra" w:hAnsi="BRH Malayalam Extra" w:cs="BRH Malayalam Extra"/>
-                <w:sz w:val="26"/>
-                <w:szCs w:val="40"/>
-              </w:rPr>
-              <w:t>–</w:t>
-            </w:r>
-            <w:r>
-              <w:rPr>
-                <w:rFonts w:ascii="BRH Malayalam Extra" w:hAnsi="BRH Malayalam Extra" w:cs="BRH Malayalam Extra"/>
-                <w:sz w:val="32"/>
-                <w:szCs w:val="40"/>
-              </w:rPr>
-              <w:t xml:space="preserve"> ekx</w:t>
-            </w:r>
-            <w:r>
-              <w:rPr>
-                <w:rFonts w:ascii="BRH Malayalam Extra" w:hAnsi="BRH Malayalam Extra" w:cs="BRH Malayalam Extra"/>
-                <w:sz w:val="26"/>
-                <w:szCs w:val="40"/>
-              </w:rPr>
-              <w:t>–</w:t>
-            </w:r>
-            <w:r>
-              <w:rPr>
-                <w:rFonts w:ascii="BRH Malayalam Extra" w:hAnsi="BRH Malayalam Extra" w:cs="BRH Malayalam Extra"/>
-                <w:sz w:val="32"/>
-                <w:szCs w:val="40"/>
-              </w:rPr>
-              <w:t xml:space="preserve"> ekx— eZ</w:t>
-            </w:r>
-            <w:r>
-              <w:rPr>
-                <w:rFonts w:ascii="BRH Malayalam Extra" w:hAnsi="BRH Malayalam Extra" w:cs="BRH Malayalam Extra"/>
-                <w:sz w:val="26"/>
-                <w:szCs w:val="40"/>
-              </w:rPr>
-              <w:t>–</w:t>
-            </w:r>
-            <w:r>
-              <w:rPr>
-                <w:rFonts w:ascii="BRH Malayalam Extra" w:hAnsi="BRH Malayalam Extra" w:cs="BRH Malayalam Extra"/>
-                <w:sz w:val="32"/>
-                <w:szCs w:val="40"/>
-              </w:rPr>
-              <w:t xml:space="preserve"> s¡e¢˜ª</w:t>
-            </w:r>
-            <w:r>
-              <w:rPr>
-                <w:rFonts w:ascii="BRH Malayalam Extra" w:hAnsi="BRH Malayalam Extra" w:cs="BRH Malayalam Extra"/>
-                <w:sz w:val="32"/>
-                <w:szCs w:val="40"/>
-                <w:highlight w:val="green"/>
-              </w:rPr>
-              <w:t>Yx</w:t>
-            </w:r>
-            <w:r>
-              <w:rPr>
-                <w:rFonts w:ascii="BRH Malayalam Extra" w:hAnsi="BRH Malayalam Extra" w:cs="BRH Malayalam Extra"/>
-                <w:sz w:val="32"/>
-                <w:szCs w:val="40"/>
-              </w:rPr>
-              <w:t xml:space="preserve"> | </w:t>
-            </w:r>
           </w:p>
           <w:p>
             <w:pPr>
@@ -10385,11 +10127,353 @@
               <w:adjustRightInd w:val="0"/>
               <w:spacing w:before="0" w:line="240" w:lineRule="auto"/>
               <w:rPr>
-                <w:rFonts w:ascii="BRH Malayalam Extra" w:hAnsi="BRH Malayalam Extra" w:cs="BRH Malayalam Extra"/>
-                <w:sz w:val="32"/>
+                <w:rFonts w:cs="BRH Malayalam Extra"/>
                 <w:szCs w:val="40"/>
               </w:rPr>
             </w:pPr>
+          </w:p>
+          <w:p>
+            <w:pPr>
+              <w:widowControl w:val="0"/>
+              <w:autoSpaceDE w:val="0"/>
+              <w:autoSpaceDN w:val="0"/>
+              <w:adjustRightInd w:val="0"/>
+              <w:spacing w:before="0" w:line="240" w:lineRule="auto"/>
+              <w:rPr>
+                <w:rFonts w:cs="BRH Malayalam Extra"/>
+                <w:szCs w:val="40"/>
+              </w:rPr>
+            </w:pPr>
+          </w:p>
+          <w:p>
+            <w:pPr>
+              <w:widowControl w:val="0"/>
+              <w:autoSpaceDE w:val="0"/>
+              <w:autoSpaceDN w:val="0"/>
+              <w:adjustRightInd w:val="0"/>
+              <w:spacing w:before="0" w:line="240" w:lineRule="auto"/>
+              <w:rPr>
+                <w:rFonts w:ascii="BRH Malayalam Extra" w:hAnsi="BRH Malayalam Extra" w:cs="BRH Malayalam Extra"/>
+                <w:sz w:val="32"/>
+                <w:szCs w:val="40"/>
+              </w:rPr>
+            </w:pPr>
+            <w:r>
+              <w:rPr>
+                <w:rFonts w:cs="BRH Malayalam Extra"/>
+                <w:szCs w:val="40"/>
+              </w:rPr>
+              <w:lastRenderedPageBreak/>
+              <w:t>29</w:t>
+            </w:r>
+            <w:r>
+              <w:rPr>
+                <w:rFonts w:ascii="BRH Malayalam Extra" w:hAnsi="BRH Malayalam Extra" w:cs="BRH Malayalam Extra"/>
+                <w:sz w:val="32"/>
+                <w:szCs w:val="40"/>
+              </w:rPr>
+              <w:t>)</w:t>
+            </w:r>
+            <w:r>
+              <w:rPr>
+                <w:rFonts w:ascii="BRH Malayalam Extra" w:hAnsi="BRH Malayalam Extra" w:cs="BRH Malayalam Extra"/>
+                <w:sz w:val="32"/>
+                <w:szCs w:val="40"/>
+              </w:rPr>
+              <w:tab/>
+            </w:r>
+            <w:r>
+              <w:rPr>
+                <w:rFonts w:cs="BRH Malayalam Extra"/>
+                <w:szCs w:val="40"/>
+              </w:rPr>
+              <w:t>1</w:t>
+            </w:r>
+            <w:r>
+              <w:rPr>
+                <w:rFonts w:ascii="BRH Malayalam Extra" w:hAnsi="BRH Malayalam Extra" w:cs="BRH Malayalam Extra"/>
+                <w:sz w:val="32"/>
+                <w:szCs w:val="40"/>
+              </w:rPr>
+              <w:t>.</w:t>
+            </w:r>
+            <w:r>
+              <w:rPr>
+                <w:rFonts w:cs="BRH Malayalam Extra"/>
+                <w:szCs w:val="40"/>
+              </w:rPr>
+              <w:t>8</w:t>
+            </w:r>
+            <w:r>
+              <w:rPr>
+                <w:rFonts w:ascii="BRH Malayalam Extra" w:hAnsi="BRH Malayalam Extra" w:cs="BRH Malayalam Extra"/>
+                <w:sz w:val="32"/>
+                <w:szCs w:val="40"/>
+              </w:rPr>
+              <w:t>.</w:t>
+            </w:r>
+            <w:r>
+              <w:rPr>
+                <w:rFonts w:cs="BRH Malayalam Extra"/>
+                <w:szCs w:val="40"/>
+              </w:rPr>
+              <w:t>4</w:t>
+            </w:r>
+            <w:r>
+              <w:rPr>
+                <w:rFonts w:ascii="BRH Malayalam Extra" w:hAnsi="BRH Malayalam Extra" w:cs="BRH Malayalam Extra"/>
+                <w:sz w:val="32"/>
+                <w:szCs w:val="40"/>
+              </w:rPr>
+              <w:t>.</w:t>
+            </w:r>
+            <w:r>
+              <w:rPr>
+                <w:rFonts w:cs="BRH Malayalam Extra"/>
+                <w:szCs w:val="40"/>
+              </w:rPr>
+              <w:t>1</w:t>
+            </w:r>
+            <w:r>
+              <w:rPr>
+                <w:rFonts w:ascii="BRH Malayalam Extra" w:hAnsi="BRH Malayalam Extra" w:cs="BRH Malayalam Extra"/>
+                <w:sz w:val="32"/>
+                <w:szCs w:val="40"/>
+              </w:rPr>
+              <w:t>(</w:t>
+            </w:r>
+            <w:r>
+              <w:rPr>
+                <w:rFonts w:cs="BRH Malayalam Extra"/>
+                <w:szCs w:val="40"/>
+              </w:rPr>
+              <w:t>22</w:t>
+            </w:r>
+            <w:r>
+              <w:rPr>
+                <w:rFonts w:ascii="BRH Malayalam Extra" w:hAnsi="BRH Malayalam Extra" w:cs="BRH Malayalam Extra"/>
+                <w:sz w:val="32"/>
+                <w:szCs w:val="40"/>
+              </w:rPr>
+              <w:t>)-  ekx˜ | e</w:t>
+            </w:r>
+            <w:r>
+              <w:rPr>
+                <w:rFonts w:ascii="BRH Malayalam Extra" w:hAnsi="BRH Malayalam Extra" w:cs="BRH Malayalam Extra"/>
+                <w:sz w:val="26"/>
+                <w:szCs w:val="40"/>
+              </w:rPr>
+              <w:t>–</w:t>
+            </w:r>
+            <w:r>
+              <w:rPr>
+                <w:rFonts w:ascii="BRH Malayalam Extra" w:hAnsi="BRH Malayalam Extra" w:cs="BRH Malayalam Extra"/>
+                <w:sz w:val="32"/>
+                <w:szCs w:val="40"/>
+              </w:rPr>
+              <w:t>Z</w:t>
+            </w:r>
+            <w:r>
+              <w:rPr>
+                <w:rFonts w:ascii="BRH Malayalam Extra" w:hAnsi="BRH Malayalam Extra" w:cs="BRH Malayalam Extra"/>
+                <w:sz w:val="26"/>
+                <w:szCs w:val="40"/>
+              </w:rPr>
+              <w:t>–</w:t>
+            </w:r>
+            <w:r>
+              <w:rPr>
+                <w:rFonts w:ascii="BRH Malayalam Extra" w:hAnsi="BRH Malayalam Extra" w:cs="BRH Malayalam Extra"/>
+                <w:sz w:val="32"/>
+                <w:szCs w:val="40"/>
+              </w:rPr>
+              <w:t xml:space="preserve"> | s¡</w:t>
+            </w:r>
+            <w:r>
+              <w:rPr>
+                <w:rFonts w:ascii="BRH Malayalam Extra" w:hAnsi="BRH Malayalam Extra" w:cs="BRH Malayalam Extra"/>
+                <w:sz w:val="32"/>
+                <w:szCs w:val="40"/>
+                <w:highlight w:val="green"/>
+              </w:rPr>
+              <w:t>e¢˜ªYx</w:t>
+            </w:r>
+            <w:r>
+              <w:rPr>
+                <w:rFonts w:ascii="BRH Malayalam Extra" w:hAnsi="BRH Malayalam Extra" w:cs="BRH Malayalam Extra"/>
+                <w:sz w:val="32"/>
+                <w:szCs w:val="40"/>
+              </w:rPr>
+              <w:t xml:space="preserve"> |</w:t>
+            </w:r>
+          </w:p>
+          <w:p>
+            <w:pPr>
+              <w:widowControl w:val="0"/>
+              <w:autoSpaceDE w:val="0"/>
+              <w:autoSpaceDN w:val="0"/>
+              <w:adjustRightInd w:val="0"/>
+              <w:spacing w:before="0" w:line="240" w:lineRule="auto"/>
+              <w:rPr>
+                <w:rFonts w:ascii="BRH Malayalam Extra" w:hAnsi="BRH Malayalam Extra" w:cs="BRH Malayalam Extra"/>
+                <w:sz w:val="32"/>
+                <w:szCs w:val="40"/>
+              </w:rPr>
+            </w:pPr>
+            <w:r>
+              <w:rPr>
+                <w:rFonts w:ascii="BRH Malayalam Extra" w:hAnsi="BRH Malayalam Extra" w:cs="BRH Malayalam Extra"/>
+                <w:sz w:val="32"/>
+                <w:szCs w:val="40"/>
+              </w:rPr>
+              <w:t>ekx— eZ eZ</w:t>
+            </w:r>
+            <w:r>
+              <w:rPr>
+                <w:rFonts w:ascii="BRH Malayalam Extra" w:hAnsi="BRH Malayalam Extra" w:cs="BRH Malayalam Extra"/>
+                <w:sz w:val="26"/>
+                <w:szCs w:val="40"/>
+              </w:rPr>
+              <w:t>–</w:t>
+            </w:r>
+            <w:r>
+              <w:rPr>
+                <w:rFonts w:ascii="BRH Malayalam Extra" w:hAnsi="BRH Malayalam Extra" w:cs="BRH Malayalam Extra"/>
+                <w:sz w:val="32"/>
+                <w:szCs w:val="40"/>
+              </w:rPr>
+              <w:t xml:space="preserve"> ekx</w:t>
+            </w:r>
+            <w:r>
+              <w:rPr>
+                <w:rFonts w:ascii="BRH Malayalam Extra" w:hAnsi="BRH Malayalam Extra" w:cs="BRH Malayalam Extra"/>
+                <w:sz w:val="26"/>
+                <w:szCs w:val="40"/>
+              </w:rPr>
+              <w:t>–</w:t>
+            </w:r>
+            <w:r>
+              <w:rPr>
+                <w:rFonts w:ascii="BRH Malayalam Extra" w:hAnsi="BRH Malayalam Extra" w:cs="BRH Malayalam Extra"/>
+                <w:sz w:val="32"/>
+                <w:szCs w:val="40"/>
+              </w:rPr>
+              <w:t xml:space="preserve"> ekx— eZ</w:t>
+            </w:r>
+            <w:r>
+              <w:rPr>
+                <w:rFonts w:ascii="BRH Malayalam Extra" w:hAnsi="BRH Malayalam Extra" w:cs="BRH Malayalam Extra"/>
+                <w:sz w:val="26"/>
+                <w:szCs w:val="40"/>
+              </w:rPr>
+              <w:t>–</w:t>
+            </w:r>
+            <w:r>
+              <w:rPr>
+                <w:rFonts w:ascii="BRH Malayalam Extra" w:hAnsi="BRH Malayalam Extra" w:cs="BRH Malayalam Extra"/>
+                <w:sz w:val="32"/>
+                <w:szCs w:val="40"/>
+              </w:rPr>
+              <w:t xml:space="preserve"> s¡e¢˜ªYx</w:t>
+            </w:r>
+            <w:r>
+              <w:rPr>
+                <w:rFonts w:ascii="BRH Malayalam Extra" w:hAnsi="BRH Malayalam Extra" w:cs="BRH Malayalam Extra"/>
+                <w:sz w:val="26"/>
+                <w:szCs w:val="40"/>
+              </w:rPr>
+              <w:t>–</w:t>
+            </w:r>
+            <w:r>
+              <w:rPr>
+                <w:rFonts w:ascii="BRH Malayalam Extra" w:hAnsi="BRH Malayalam Extra" w:cs="BRH Malayalam Extra"/>
+                <w:sz w:val="32"/>
+                <w:szCs w:val="40"/>
+              </w:rPr>
+              <w:t xml:space="preserve"> s¡e¢˜ª</w:t>
+            </w:r>
+            <w:r>
+              <w:rPr>
+                <w:rFonts w:ascii="BRH Malayalam Extra" w:hAnsi="BRH Malayalam Extra" w:cs="BRH Malayalam Extra"/>
+                <w:sz w:val="32"/>
+                <w:szCs w:val="40"/>
+                <w:highlight w:val="green"/>
+              </w:rPr>
+              <w:t>Yx</w:t>
+            </w:r>
+            <w:r>
+              <w:rPr>
+                <w:rFonts w:ascii="BRH Malayalam Extra" w:hAnsi="BRH Malayalam Extra" w:cs="BRH Malayalam Extra"/>
+                <w:sz w:val="32"/>
+                <w:szCs w:val="40"/>
+              </w:rPr>
+              <w:t xml:space="preserve"> eZ</w:t>
+            </w:r>
+            <w:r>
+              <w:rPr>
+                <w:rFonts w:ascii="BRH Malayalam Extra" w:hAnsi="BRH Malayalam Extra" w:cs="BRH Malayalam Extra"/>
+                <w:sz w:val="26"/>
+                <w:szCs w:val="40"/>
+              </w:rPr>
+              <w:t>–</w:t>
+            </w:r>
+            <w:r>
+              <w:rPr>
+                <w:rFonts w:ascii="BRH Malayalam Extra" w:hAnsi="BRH Malayalam Extra" w:cs="BRH Malayalam Extra"/>
+                <w:sz w:val="32"/>
+                <w:szCs w:val="40"/>
+              </w:rPr>
+              <w:t xml:space="preserve"> ekx</w:t>
+            </w:r>
+            <w:r>
+              <w:rPr>
+                <w:rFonts w:ascii="BRH Malayalam Extra" w:hAnsi="BRH Malayalam Extra" w:cs="BRH Malayalam Extra"/>
+                <w:sz w:val="26"/>
+                <w:szCs w:val="40"/>
+              </w:rPr>
+              <w:t>–</w:t>
+            </w:r>
+            <w:r>
+              <w:rPr>
+                <w:rFonts w:ascii="BRH Malayalam Extra" w:hAnsi="BRH Malayalam Extra" w:cs="BRH Malayalam Extra"/>
+                <w:sz w:val="32"/>
+                <w:szCs w:val="40"/>
+              </w:rPr>
+              <w:t xml:space="preserve"> ekx— eZ</w:t>
+            </w:r>
+            <w:r>
+              <w:rPr>
+                <w:rFonts w:ascii="BRH Malayalam Extra" w:hAnsi="BRH Malayalam Extra" w:cs="BRH Malayalam Extra"/>
+                <w:sz w:val="26"/>
+                <w:szCs w:val="40"/>
+              </w:rPr>
+              <w:t>–</w:t>
+            </w:r>
+            <w:r>
+              <w:rPr>
+                <w:rFonts w:ascii="BRH Malayalam Extra" w:hAnsi="BRH Malayalam Extra" w:cs="BRH Malayalam Extra"/>
+                <w:sz w:val="32"/>
+                <w:szCs w:val="40"/>
+              </w:rPr>
+              <w:t xml:space="preserve"> s¡e¢˜ª</w:t>
+            </w:r>
+            <w:r>
+              <w:rPr>
+                <w:rFonts w:ascii="BRH Malayalam Extra" w:hAnsi="BRH Malayalam Extra" w:cs="BRH Malayalam Extra"/>
+                <w:sz w:val="32"/>
+                <w:szCs w:val="40"/>
+                <w:highlight w:val="green"/>
+              </w:rPr>
+              <w:t>Yx</w:t>
+            </w:r>
+            <w:r>
+              <w:rPr>
+                <w:rFonts w:ascii="BRH Malayalam Extra" w:hAnsi="BRH Malayalam Extra" w:cs="BRH Malayalam Extra"/>
+                <w:sz w:val="32"/>
+                <w:szCs w:val="40"/>
+              </w:rPr>
+              <w:t xml:space="preserve"> | </w:t>
+            </w:r>
           </w:p>
           <w:p>
             <w:pPr>
@@ -11318,6 +11402,7 @@
                 <w:szCs w:val="40"/>
                 <w:lang w:val="it-IT"/>
               </w:rPr>
+              <w:lastRenderedPageBreak/>
               <w:t>5</w:t>
             </w:r>
             <w:r>
@@ -11937,115 +12022,115 @@
                 <w:szCs w:val="40"/>
                 <w:lang w:val="it-IT"/>
               </w:rPr>
+              <w:t>¥i</w:t>
+            </w:r>
+            <w:r>
+              <w:rPr>
+                <w:rFonts w:ascii="BRH Malayalam Extra" w:hAnsi="BRH Malayalam Extra" w:cs="BRH Malayalam Extra"/>
+                <w:sz w:val="26"/>
+                <w:szCs w:val="40"/>
+                <w:lang w:val="it-IT"/>
+              </w:rPr>
+              <w:t>–</w:t>
+            </w:r>
+            <w:r>
+              <w:rPr>
+                <w:rFonts w:ascii="BRH Malayalam Extra" w:hAnsi="BRH Malayalam Extra" w:cs="BRH Malayalam Extra"/>
+                <w:sz w:val="32"/>
+                <w:szCs w:val="40"/>
+                <w:lang w:val="it-IT"/>
+              </w:rPr>
+              <w:t>rõx— Apxp— ¥i</w:t>
+            </w:r>
+            <w:r>
+              <w:rPr>
+                <w:rFonts w:ascii="BRH Malayalam Extra" w:hAnsi="BRH Malayalam Extra" w:cs="BRH Malayalam Extra"/>
+                <w:sz w:val="26"/>
+                <w:szCs w:val="40"/>
+                <w:lang w:val="it-IT"/>
+              </w:rPr>
+              <w:t>–</w:t>
+            </w:r>
+            <w:r>
+              <w:rPr>
+                <w:rFonts w:ascii="BRH Malayalam Extra" w:hAnsi="BRH Malayalam Extra" w:cs="BRH Malayalam Extra"/>
+                <w:sz w:val="32"/>
+                <w:szCs w:val="40"/>
+                <w:lang w:val="it-IT"/>
+              </w:rPr>
+              <w:t>¤¤rõ— ¥i</w:t>
+            </w:r>
+            <w:r>
+              <w:rPr>
+                <w:rFonts w:ascii="BRH Malayalam Extra" w:hAnsi="BRH Malayalam Extra" w:cs="BRH Malayalam Extra"/>
+                <w:sz w:val="26"/>
+                <w:szCs w:val="40"/>
+                <w:lang w:val="it-IT"/>
+              </w:rPr>
+              <w:t>–</w:t>
+            </w:r>
+            <w:r>
+              <w:rPr>
+                <w:rFonts w:ascii="BRH Malayalam Extra" w:hAnsi="BRH Malayalam Extra" w:cs="BRH Malayalam Extra"/>
+                <w:sz w:val="32"/>
+                <w:szCs w:val="40"/>
+                <w:lang w:val="it-IT"/>
+              </w:rPr>
+              <w:t>rõx</w:t>
+            </w:r>
+            <w:r>
+              <w:rPr>
+                <w:rFonts w:ascii="BRH Malayalam Extra" w:hAnsi="BRH Malayalam Extra" w:cs="BRH Malayalam Extra"/>
+                <w:sz w:val="26"/>
+                <w:szCs w:val="40"/>
+                <w:lang w:val="it-IT"/>
+              </w:rPr>
+              <w:t>–</w:t>
+            </w:r>
+            <w:r>
+              <w:rPr>
+                <w:rFonts w:ascii="BRH Malayalam Extra" w:hAnsi="BRH Malayalam Extra" w:cs="BRH Malayalam Extra"/>
+                <w:sz w:val="32"/>
+                <w:szCs w:val="40"/>
+                <w:lang w:val="it-IT"/>
+              </w:rPr>
+              <w:t xml:space="preserve"> Apx˜Igx</w:t>
+            </w:r>
+            <w:r>
+              <w:rPr>
+                <w:rFonts w:ascii="BRH Malayalam Extra" w:hAnsi="BRH Malayalam Extra" w:cs="BRH Malayalam Extra"/>
+                <w:sz w:val="26"/>
+                <w:szCs w:val="40"/>
+                <w:lang w:val="it-IT"/>
+              </w:rPr>
+              <w:t>–</w:t>
+            </w:r>
+            <w:r>
+              <w:rPr>
+                <w:rFonts w:ascii="BRH Malayalam Extra" w:hAnsi="BRH Malayalam Extra" w:cs="BRH Malayalam Extra"/>
+                <w:sz w:val="32"/>
+                <w:szCs w:val="40"/>
+                <w:lang w:val="it-IT"/>
+              </w:rPr>
+              <w:t xml:space="preserve"> Igxp— ¥i</w:t>
+            </w:r>
+            <w:r>
+              <w:rPr>
+                <w:rFonts w:ascii="BRH Malayalam Extra" w:hAnsi="BRH Malayalam Extra" w:cs="BRH Malayalam Extra"/>
+                <w:sz w:val="26"/>
+                <w:szCs w:val="40"/>
+                <w:lang w:val="it-IT"/>
+              </w:rPr>
+              <w:t>–</w:t>
+            </w:r>
+            <w:r>
+              <w:rPr>
+                <w:rFonts w:ascii="BRH Malayalam Extra" w:hAnsi="BRH Malayalam Extra" w:cs="BRH Malayalam Extra"/>
+                <w:sz w:val="32"/>
+                <w:szCs w:val="40"/>
+                <w:lang w:val="it-IT"/>
+              </w:rPr>
               <w:lastRenderedPageBreak/>
-              <w:t>¥i</w:t>
-            </w:r>
-            <w:r>
-              <w:rPr>
-                <w:rFonts w:ascii="BRH Malayalam Extra" w:hAnsi="BRH Malayalam Extra" w:cs="BRH Malayalam Extra"/>
-                <w:sz w:val="26"/>
-                <w:szCs w:val="40"/>
-                <w:lang w:val="it-IT"/>
-              </w:rPr>
-              <w:t>–</w:t>
-            </w:r>
-            <w:r>
-              <w:rPr>
-                <w:rFonts w:ascii="BRH Malayalam Extra" w:hAnsi="BRH Malayalam Extra" w:cs="BRH Malayalam Extra"/>
-                <w:sz w:val="32"/>
-                <w:szCs w:val="40"/>
-                <w:lang w:val="it-IT"/>
-              </w:rPr>
-              <w:t>rõx— Apxp— ¥i</w:t>
-            </w:r>
-            <w:r>
-              <w:rPr>
-                <w:rFonts w:ascii="BRH Malayalam Extra" w:hAnsi="BRH Malayalam Extra" w:cs="BRH Malayalam Extra"/>
-                <w:sz w:val="26"/>
-                <w:szCs w:val="40"/>
-                <w:lang w:val="it-IT"/>
-              </w:rPr>
-              <w:t>–</w:t>
-            </w:r>
-            <w:r>
-              <w:rPr>
-                <w:rFonts w:ascii="BRH Malayalam Extra" w:hAnsi="BRH Malayalam Extra" w:cs="BRH Malayalam Extra"/>
-                <w:sz w:val="32"/>
-                <w:szCs w:val="40"/>
-                <w:lang w:val="it-IT"/>
-              </w:rPr>
-              <w:t>¤¤rõ— ¥i</w:t>
-            </w:r>
-            <w:r>
-              <w:rPr>
-                <w:rFonts w:ascii="BRH Malayalam Extra" w:hAnsi="BRH Malayalam Extra" w:cs="BRH Malayalam Extra"/>
-                <w:sz w:val="26"/>
-                <w:szCs w:val="40"/>
-                <w:lang w:val="it-IT"/>
-              </w:rPr>
-              <w:t>–</w:t>
-            </w:r>
-            <w:r>
-              <w:rPr>
-                <w:rFonts w:ascii="BRH Malayalam Extra" w:hAnsi="BRH Malayalam Extra" w:cs="BRH Malayalam Extra"/>
-                <w:sz w:val="32"/>
-                <w:szCs w:val="40"/>
-                <w:lang w:val="it-IT"/>
-              </w:rPr>
-              <w:t>rõx</w:t>
-            </w:r>
-            <w:r>
-              <w:rPr>
-                <w:rFonts w:ascii="BRH Malayalam Extra" w:hAnsi="BRH Malayalam Extra" w:cs="BRH Malayalam Extra"/>
-                <w:sz w:val="26"/>
-                <w:szCs w:val="40"/>
-                <w:lang w:val="it-IT"/>
-              </w:rPr>
-              <w:t>–</w:t>
-            </w:r>
-            <w:r>
-              <w:rPr>
-                <w:rFonts w:ascii="BRH Malayalam Extra" w:hAnsi="BRH Malayalam Extra" w:cs="BRH Malayalam Extra"/>
-                <w:sz w:val="32"/>
-                <w:szCs w:val="40"/>
-                <w:lang w:val="it-IT"/>
-              </w:rPr>
-              <w:t xml:space="preserve"> Apx˜Igx</w:t>
-            </w:r>
-            <w:r>
-              <w:rPr>
-                <w:rFonts w:ascii="BRH Malayalam Extra" w:hAnsi="BRH Malayalam Extra" w:cs="BRH Malayalam Extra"/>
-                <w:sz w:val="26"/>
-                <w:szCs w:val="40"/>
-                <w:lang w:val="it-IT"/>
-              </w:rPr>
-              <w:t>–</w:t>
-            </w:r>
-            <w:r>
-              <w:rPr>
-                <w:rFonts w:ascii="BRH Malayalam Extra" w:hAnsi="BRH Malayalam Extra" w:cs="BRH Malayalam Extra"/>
-                <w:sz w:val="32"/>
-                <w:szCs w:val="40"/>
-                <w:lang w:val="it-IT"/>
-              </w:rPr>
-              <w:t xml:space="preserve"> Igxp— ¥i</w:t>
-            </w:r>
-            <w:r>
-              <w:rPr>
-                <w:rFonts w:ascii="BRH Malayalam Extra" w:hAnsi="BRH Malayalam Extra" w:cs="BRH Malayalam Extra"/>
-                <w:sz w:val="26"/>
-                <w:szCs w:val="40"/>
-                <w:lang w:val="it-IT"/>
-              </w:rPr>
-              <w:t>–</w:t>
-            </w:r>
-            <w:r>
-              <w:rPr>
-                <w:rFonts w:ascii="BRH Malayalam Extra" w:hAnsi="BRH Malayalam Extra" w:cs="BRH Malayalam Extra"/>
-                <w:sz w:val="32"/>
-                <w:szCs w:val="40"/>
-                <w:lang w:val="it-IT"/>
-              </w:rPr>
               <w:t>¤¤rõ— ¥i</w:t>
             </w:r>
             <w:r>
@@ -12678,90 +12763,99 @@
                 <w:szCs w:val="40"/>
                 <w:lang w:val="it-IT"/>
               </w:rPr>
+              <w:t>¥i</w:t>
+            </w:r>
+            <w:r>
+              <w:rPr>
+                <w:rFonts w:ascii="BRH Malayalam Extra" w:hAnsi="BRH Malayalam Extra" w:cs="BRH Malayalam Extra"/>
+                <w:sz w:val="26"/>
+                <w:szCs w:val="40"/>
+                <w:lang w:val="it-IT"/>
+              </w:rPr>
+              <w:t>–</w:t>
+            </w:r>
+            <w:r>
+              <w:rPr>
+                <w:rFonts w:ascii="BRH Malayalam Extra" w:hAnsi="BRH Malayalam Extra" w:cs="BRH Malayalam Extra"/>
+                <w:sz w:val="32"/>
+                <w:szCs w:val="40"/>
+                <w:lang w:val="it-IT"/>
+              </w:rPr>
+              <w:t>rõx— Apxp— ¥i</w:t>
+            </w:r>
+            <w:r>
+              <w:rPr>
+                <w:rFonts w:ascii="BRH Malayalam Extra" w:hAnsi="BRH Malayalam Extra" w:cs="BRH Malayalam Extra"/>
+                <w:sz w:val="26"/>
+                <w:szCs w:val="40"/>
+                <w:lang w:val="it-IT"/>
+              </w:rPr>
+              <w:t>–</w:t>
+            </w:r>
+            <w:r>
+              <w:rPr>
+                <w:rFonts w:ascii="BRH Malayalam Extra" w:hAnsi="BRH Malayalam Extra" w:cs="BRH Malayalam Extra"/>
+                <w:sz w:val="32"/>
+                <w:szCs w:val="40"/>
+                <w:lang w:val="it-IT"/>
+              </w:rPr>
+              <w:t>¤¤rõ— ¥i</w:t>
+            </w:r>
+            <w:r>
+              <w:rPr>
+                <w:rFonts w:ascii="BRH Malayalam Extra" w:hAnsi="BRH Malayalam Extra" w:cs="BRH Malayalam Extra"/>
+                <w:sz w:val="26"/>
+                <w:szCs w:val="40"/>
+                <w:lang w:val="it-IT"/>
+              </w:rPr>
+              <w:t>–</w:t>
+            </w:r>
+            <w:r>
+              <w:rPr>
+                <w:rFonts w:ascii="BRH Malayalam Extra" w:hAnsi="BRH Malayalam Extra" w:cs="BRH Malayalam Extra"/>
+                <w:sz w:val="32"/>
+                <w:szCs w:val="40"/>
+                <w:highlight w:val="green"/>
+                <w:lang w:val="it-IT"/>
+              </w:rPr>
+              <w:t>rõx</w:t>
+            </w:r>
+            <w:r>
+              <w:rPr>
+                <w:rFonts w:ascii="BRH Malayalam Extra" w:hAnsi="BRH Malayalam Extra" w:cs="BRH Malayalam Extra"/>
+                <w:sz w:val="32"/>
+                <w:szCs w:val="40"/>
+                <w:lang w:val="it-IT"/>
+              </w:rPr>
+              <w:t>— Apx˜Igx</w:t>
+            </w:r>
+            <w:r>
+              <w:rPr>
+                <w:rFonts w:ascii="BRH Malayalam Extra" w:hAnsi="BRH Malayalam Extra" w:cs="BRH Malayalam Extra"/>
+                <w:sz w:val="26"/>
+                <w:szCs w:val="40"/>
+                <w:lang w:val="it-IT"/>
+              </w:rPr>
+              <w:t>–</w:t>
+            </w:r>
+            <w:r>
+              <w:rPr>
+                <w:rFonts w:ascii="BRH Malayalam Extra" w:hAnsi="BRH Malayalam Extra" w:cs="BRH Malayalam Extra"/>
+                <w:sz w:val="32"/>
+                <w:szCs w:val="40"/>
+                <w:lang w:val="it-IT"/>
+              </w:rPr>
+              <w:t xml:space="preserve"> Igxp— </w:t>
+            </w:r>
+            <w:r>
+              <w:rPr>
+                <w:rFonts w:ascii="BRH Malayalam Extra" w:hAnsi="BRH Malayalam Extra" w:cs="BRH Malayalam Extra"/>
+                <w:sz w:val="32"/>
+                <w:szCs w:val="40"/>
+                <w:lang w:val="it-IT"/>
+              </w:rPr>
               <w:lastRenderedPageBreak/>
               <w:t>¥i</w:t>
-            </w:r>
-            <w:r>
-              <w:rPr>
-                <w:rFonts w:ascii="BRH Malayalam Extra" w:hAnsi="BRH Malayalam Extra" w:cs="BRH Malayalam Extra"/>
-                <w:sz w:val="26"/>
-                <w:szCs w:val="40"/>
-                <w:lang w:val="it-IT"/>
-              </w:rPr>
-              <w:t>–</w:t>
-            </w:r>
-            <w:r>
-              <w:rPr>
-                <w:rFonts w:ascii="BRH Malayalam Extra" w:hAnsi="BRH Malayalam Extra" w:cs="BRH Malayalam Extra"/>
-                <w:sz w:val="32"/>
-                <w:szCs w:val="40"/>
-                <w:lang w:val="it-IT"/>
-              </w:rPr>
-              <w:t>rõx— Apxp— ¥i</w:t>
-            </w:r>
-            <w:r>
-              <w:rPr>
-                <w:rFonts w:ascii="BRH Malayalam Extra" w:hAnsi="BRH Malayalam Extra" w:cs="BRH Malayalam Extra"/>
-                <w:sz w:val="26"/>
-                <w:szCs w:val="40"/>
-                <w:lang w:val="it-IT"/>
-              </w:rPr>
-              <w:t>–</w:t>
-            </w:r>
-            <w:r>
-              <w:rPr>
-                <w:rFonts w:ascii="BRH Malayalam Extra" w:hAnsi="BRH Malayalam Extra" w:cs="BRH Malayalam Extra"/>
-                <w:sz w:val="32"/>
-                <w:szCs w:val="40"/>
-                <w:lang w:val="it-IT"/>
-              </w:rPr>
-              <w:t>¤¤rõ— ¥i</w:t>
-            </w:r>
-            <w:r>
-              <w:rPr>
-                <w:rFonts w:ascii="BRH Malayalam Extra" w:hAnsi="BRH Malayalam Extra" w:cs="BRH Malayalam Extra"/>
-                <w:sz w:val="26"/>
-                <w:szCs w:val="40"/>
-                <w:lang w:val="it-IT"/>
-              </w:rPr>
-              <w:t>–</w:t>
-            </w:r>
-            <w:r>
-              <w:rPr>
-                <w:rFonts w:ascii="BRH Malayalam Extra" w:hAnsi="BRH Malayalam Extra" w:cs="BRH Malayalam Extra"/>
-                <w:sz w:val="32"/>
-                <w:szCs w:val="40"/>
-                <w:highlight w:val="green"/>
-                <w:lang w:val="it-IT"/>
-              </w:rPr>
-              <w:t>rõx</w:t>
-            </w:r>
-            <w:r>
-              <w:rPr>
-                <w:rFonts w:ascii="BRH Malayalam Extra" w:hAnsi="BRH Malayalam Extra" w:cs="BRH Malayalam Extra"/>
-                <w:sz w:val="32"/>
-                <w:szCs w:val="40"/>
-                <w:lang w:val="it-IT"/>
-              </w:rPr>
-              <w:t>— Apx˜Igx</w:t>
-            </w:r>
-            <w:r>
-              <w:rPr>
-                <w:rFonts w:ascii="BRH Malayalam Extra" w:hAnsi="BRH Malayalam Extra" w:cs="BRH Malayalam Extra"/>
-                <w:sz w:val="26"/>
-                <w:szCs w:val="40"/>
-                <w:lang w:val="it-IT"/>
-              </w:rPr>
-              <w:t>–</w:t>
-            </w:r>
-            <w:r>
-              <w:rPr>
-                <w:rFonts w:ascii="BRH Malayalam Extra" w:hAnsi="BRH Malayalam Extra" w:cs="BRH Malayalam Extra"/>
-                <w:sz w:val="32"/>
-                <w:szCs w:val="40"/>
-                <w:lang w:val="it-IT"/>
-              </w:rPr>
-              <w:t xml:space="preserve"> Igxp— ¥i</w:t>
             </w:r>
             <w:r>
               <w:rPr>
@@ -15311,6 +15405,7 @@
                 <w:rFonts w:cs="BRH Malayalam Extra"/>
                 <w:szCs w:val="40"/>
               </w:rPr>
+              <w:lastRenderedPageBreak/>
               <w:t>22</w:t>
             </w:r>
             <w:r>
@@ -16819,6 +16914,7 @@
                 <w:szCs w:val="40"/>
                 <w:lang w:val="it-IT"/>
               </w:rPr>
+              <w:lastRenderedPageBreak/>
               <w:t>22</w:t>
             </w:r>
             <w:r>
@@ -18844,17 +18940,7 @@
                 <w:szCs w:val="40"/>
                 <w:lang w:val="it-IT"/>
               </w:rPr>
-              <w:t xml:space="preserve"> ¥jöÉx—</w:t>
-            </w:r>
-            <w:r>
-              <w:rPr>
-                <w:rFonts w:ascii="BRH Malayalam Extra" w:hAnsi="BRH Malayalam Extra" w:cs="BRH Malayalam Extra"/>
-                <w:sz w:val="32"/>
-                <w:szCs w:val="40"/>
-                <w:lang w:val="it-IT"/>
-              </w:rPr>
-              <w:lastRenderedPageBreak/>
-              <w:t>jx(³§)¥tx</w:t>
+              <w:t xml:space="preserve"> ¥jöÉx—jx(³§)¥tx</w:t>
             </w:r>
             <w:r>
               <w:rPr>
@@ -18913,6 +18999,7 @@
                 <w:szCs w:val="40"/>
                 <w:lang w:val="it-IT"/>
               </w:rPr>
+              <w:lastRenderedPageBreak/>
               <w:t>42</w:t>
             </w:r>
             <w:r>
@@ -20342,17 +20429,7 @@
                 <w:szCs w:val="40"/>
                 <w:lang w:val="it-IT"/>
               </w:rPr>
-              <w:t xml:space="preserve"> ¥jöÉx—</w:t>
-            </w:r>
-            <w:r>
-              <w:rPr>
-                <w:rFonts w:ascii="BRH Malayalam Extra" w:hAnsi="BRH Malayalam Extra" w:cs="BRH Malayalam Extra"/>
-                <w:sz w:val="32"/>
-                <w:szCs w:val="40"/>
-                <w:lang w:val="it-IT"/>
-              </w:rPr>
-              <w:lastRenderedPageBreak/>
-              <w:t>jx(³§)¥tx</w:t>
+              <w:t xml:space="preserve"> ¥jöÉx—jx(³§)¥tx</w:t>
             </w:r>
             <w:r>
               <w:rPr>
@@ -20411,6 +20488,7 @@
                 <w:szCs w:val="40"/>
                 <w:lang w:val="it-IT"/>
               </w:rPr>
+              <w:lastRenderedPageBreak/>
               <w:t>42</w:t>
             </w:r>
             <w:r>
@@ -22644,6 +22722,7 @@
                 <w:rFonts w:cs="BRH Malayalam Extra"/>
                 <w:szCs w:val="40"/>
               </w:rPr>
+              <w:lastRenderedPageBreak/>
               <w:t>40</w:t>
             </w:r>
             <w:r>
@@ -24473,6 +24552,7 @@
                 <w:rFonts w:cs="BRH Malayalam Extra"/>
                 <w:szCs w:val="40"/>
               </w:rPr>
+              <w:lastRenderedPageBreak/>
               <w:t>40</w:t>
             </w:r>
             <w:r>
@@ -26291,16 +26371,7 @@
                 <w:sz w:val="32"/>
                 <w:szCs w:val="40"/>
               </w:rPr>
-              <w:t xml:space="preserve">qO§Mz— </w:t>
-            </w:r>
-            <w:r>
-              <w:rPr>
-                <w:rFonts w:ascii="BRH Malayalam Extra" w:hAnsi="BRH Malayalam Extra" w:cs="BRH Malayalam Extra"/>
-                <w:sz w:val="32"/>
-                <w:szCs w:val="40"/>
-              </w:rPr>
-              <w:lastRenderedPageBreak/>
-              <w:t>e</w:t>
+              <w:t>qO§Mz— e</w:t>
             </w:r>
             <w:r>
               <w:rPr>
@@ -26349,25 +26420,12 @@
                 <w:szCs w:val="40"/>
               </w:rPr>
             </w:pPr>
-          </w:p>
-          <w:p>
-            <w:pPr>
-              <w:widowControl w:val="0"/>
-              <w:autoSpaceDE w:val="0"/>
-              <w:autoSpaceDN w:val="0"/>
-              <w:adjustRightInd w:val="0"/>
-              <w:spacing w:before="0" w:line="240" w:lineRule="auto"/>
-              <w:rPr>
-                <w:rFonts w:ascii="BRH Malayalam Extra" w:hAnsi="BRH Malayalam Extra" w:cs="BRH Malayalam Extra"/>
-                <w:sz w:val="32"/>
-                <w:szCs w:val="40"/>
-              </w:rPr>
-            </w:pPr>
-            <w:r>
-              <w:rPr>
-                <w:rFonts w:cs="BRH Malayalam Extra"/>
-                <w:szCs w:val="40"/>
-              </w:rPr>
+            <w:r>
+              <w:rPr>
+                <w:rFonts w:cs="BRH Malayalam Extra"/>
+                <w:szCs w:val="40"/>
+              </w:rPr>
+              <w:lastRenderedPageBreak/>
               <w:t>16</w:t>
             </w:r>
             <w:r>
@@ -27755,16 +27813,7 @@
                 <w:sz w:val="32"/>
                 <w:szCs w:val="40"/>
               </w:rPr>
-              <w:t xml:space="preserve">qO§Mz— </w:t>
-            </w:r>
-            <w:r>
-              <w:rPr>
-                <w:rFonts w:ascii="BRH Malayalam Extra" w:hAnsi="BRH Malayalam Extra" w:cs="BRH Malayalam Extra"/>
-                <w:sz w:val="32"/>
-                <w:szCs w:val="40"/>
-              </w:rPr>
-              <w:lastRenderedPageBreak/>
-              <w:t>e</w:t>
+              <w:t>qO§Mz— e</w:t>
             </w:r>
             <w:r>
               <w:rPr>
@@ -27813,25 +27862,12 @@
                 <w:szCs w:val="40"/>
               </w:rPr>
             </w:pPr>
-          </w:p>
-          <w:p>
-            <w:pPr>
-              <w:widowControl w:val="0"/>
-              <w:autoSpaceDE w:val="0"/>
-              <w:autoSpaceDN w:val="0"/>
-              <w:adjustRightInd w:val="0"/>
-              <w:spacing w:before="0" w:line="240" w:lineRule="auto"/>
-              <w:rPr>
-                <w:rFonts w:ascii="BRH Malayalam Extra" w:hAnsi="BRH Malayalam Extra" w:cs="BRH Malayalam Extra"/>
-                <w:sz w:val="32"/>
-                <w:szCs w:val="40"/>
-              </w:rPr>
-            </w:pPr>
-            <w:r>
-              <w:rPr>
-                <w:rFonts w:cs="BRH Malayalam Extra"/>
-                <w:szCs w:val="40"/>
-              </w:rPr>
+            <w:r>
+              <w:rPr>
+                <w:rFonts w:cs="BRH Malayalam Extra"/>
+                <w:szCs w:val="40"/>
+              </w:rPr>
+              <w:lastRenderedPageBreak/>
               <w:t>16</w:t>
             </w:r>
             <w:r>
@@ -29385,7 +29421,6 @@
                 <w:sz w:val="32"/>
                 <w:szCs w:val="40"/>
               </w:rPr>
-              <w:lastRenderedPageBreak/>
               <w:t>C</w:t>
             </w:r>
             <w:r>
@@ -29482,7 +29517,6 @@
                 <w:rFonts w:cs="BRH Malayalam Extra"/>
                 <w:szCs w:val="40"/>
               </w:rPr>
-              <w:lastRenderedPageBreak/>
               <w:t>52</w:t>
             </w:r>
             <w:r>
@@ -30124,7 +30158,6 @@
                 <w:sz w:val="32"/>
                 <w:szCs w:val="40"/>
               </w:rPr>
-              <w:lastRenderedPageBreak/>
               <w:t>C</w:t>
             </w:r>
             <w:r>
@@ -30504,7 +30537,29 @@
                 <w:sz w:val="32"/>
                 <w:szCs w:val="40"/>
               </w:rPr>
-              <w:t xml:space="preserve">öbx py p£—tZI </w:t>
+              <w:t xml:space="preserve">öbx py </w:t>
+            </w:r>
+          </w:p>
+          <w:p>
+            <w:pPr>
+              <w:widowControl w:val="0"/>
+              <w:autoSpaceDE w:val="0"/>
+              <w:autoSpaceDN w:val="0"/>
+              <w:adjustRightInd w:val="0"/>
+              <w:spacing w:before="0" w:line="240" w:lineRule="auto"/>
+              <w:rPr>
+                <w:rFonts w:ascii="BRH Malayalam Extra" w:hAnsi="BRH Malayalam Extra" w:cs="BRH Malayalam Extra"/>
+                <w:sz w:val="32"/>
+                <w:szCs w:val="40"/>
+              </w:rPr>
+            </w:pPr>
+            <w:r>
+              <w:rPr>
+                <w:rFonts w:ascii="BRH Malayalam Extra" w:hAnsi="BRH Malayalam Extra" w:cs="BRH Malayalam Extra"/>
+                <w:sz w:val="32"/>
+                <w:szCs w:val="40"/>
+              </w:rPr>
+              <w:t xml:space="preserve">p£—tZI </w:t>
             </w:r>
             <w:r>
               <w:rPr>
@@ -32984,19 +33039,6 @@
           <w:u w:val="single"/>
         </w:rPr>
       </w:pPr>
-    </w:p>
-    <w:p>
-      <w:pPr>
-        <w:spacing w:before="0" w:line="240" w:lineRule="auto"/>
-        <w:jc w:val="center"/>
-        <w:rPr>
-          <w:b/>
-          <w:bCs/>
-          <w:sz w:val="32"/>
-          <w:szCs w:val="32"/>
-          <w:u w:val="single"/>
-        </w:rPr>
-      </w:pPr>
       <w:r>
         <w:rPr>
           <w:b/>
@@ -33005,6 +33047,7 @@
           <w:szCs w:val="32"/>
           <w:u w:val="single"/>
         </w:rPr>
+        <w:lastRenderedPageBreak/>
         <w:t>TS Ghanam – TS 1.</w:t>
       </w:r>
       <w:r>

</xml_diff>